<commit_message>
add: raw minutes HTML + sync delivery_v9.9 and docs
- 117 raw FOMC minutes .htm files for reproducibility
- Synced delivery_v9.9 computational details, QA, speech script
- Updated docs/Beyond_the_Rate_JMP_v9.docx
</commit_message>
<xml_diff>
--- a/delivery_v9.9/Monetary_Policy_Lab_Computational_Details.docx
+++ b/delivery_v9.9/Monetary_Policy_Lab_Computational_Details.docx
@@ -2352,7 +2352,7 @@
         <w:pStyle w:val="Heading4"/>
       </w:pPr>
       <w:r>
-        <w:t xml:space="preserve">Loughran-McDonald (2011) Financial Sentiment Dictionary</w:t>
+        <w:t>Loughran-McDonald (2011) Financial Sentiment Dictionary (Eq. 1)</w:t>
       </w:r>
     </w:p>
     <w:p>
@@ -2482,7 +2482,7 @@
         <w:pStyle w:val="Heading4"/>
       </w:pPr>
       <w:r>
-        <w:t xml:space="preserve">Central Bank Hawkish-Dovish Dictionary</w:t>
+        <w:t>Central Bank Hawkish-Dovish Dictionary (Eq. 2)</w:t>
       </w:r>
     </w:p>
     <w:p>
@@ -2612,7 +2612,7 @@
         <w:pStyle w:val="Heading4"/>
       </w:pPr>
       <w:r>
-        <w:t xml:space="preserve">Combined Sentiment</w:t>
+        <w:t>Combined Sentiment (Eq. 3)</w:t>
       </w:r>
     </w:p>
     <w:p>
@@ -4711,7 +4711,7 @@
         <w:pStyle w:val="Heading3"/>
       </w:pPr>
       <w:r>
-        <w:t xml:space="preserve">5.1 H1: Sentiment ↔ Surprise</w:t>
+        <w:t>5.1 H1 (Equation 4): Sentiment ↔ Surprise</w:t>
       </w:r>
     </w:p>
     <w:p>
@@ -5176,7 +5176,7 @@
         <w:pStyle w:val="Heading3"/>
       </w:pPr>
       <w:r>
-        <w:t xml:space="preserve">5.2 H2: Asset Return Response to Shocks</w:t>
+        <w:t>5.2 H2 (Equation 5): Asset Return Response to Shocks</w:t>
       </w:r>
     </w:p>
     <w:p>
@@ -5745,7 +5745,7 @@
         <w:pStyle w:val="Heading3"/>
       </w:pPr>
       <w:r>
-        <w:t xml:space="preserve">5.3 H3: Information Channel Test</w:t>
+        <w:t>5.3 H3 (Equation 7): Information Channel Test</w:t>
       </w:r>
     </w:p>
     <w:p>
@@ -5753,7 +5753,7 @@
         <w:pStyle w:val="FirstParagraph"/>
       </w:pPr>
       <w:r>
-        <w:t xml:space="preserve">The path shock does NOT have a significantly larger effect than the target shock. Wald test p = 0.90. Evidence is suggestive but not conclusive.</w:t>
+        <w:t>The path shock does NOT have a significantly larger effect than the target shock. Wald test (Equation 6) p = 0.90. Evidence is suggestive but not conclusive.</w:t>
       </w:r>
     </w:p>
     <w:bookmarkEnd w:id="43"/>
@@ -5763,7 +5763,7 @@
         <w:pStyle w:val="Heading3"/>
       </w:pPr>
       <w:r>
-        <w:t xml:space="preserve">5.4 H4: Forward Guidance Interaction</w:t>
+        <w:t>5.4 H4 (Equation 7): Forward Guidance Interaction</w:t>
       </w:r>
     </w:p>
     <w:p>

</xml_diff>